<commit_message>
Complete callback privacy, future traceability and submission verification
</commit_message>
<xml_diff>
--- a/artifacts/hackathon/malgyeol-policy-proposal.docx
+++ b/artifacts/hackathon/malgyeol-policy-proposal.docx
@@ -2585,7 +2585,7 @@
           <w:color w:val="1E2124"/>
           <w:sz w:val="22"/>
         </w:rPr>
-        <w:t xml:space="preserve">음성 연결 검증: 설치 SDK의 세션 준비 이전 역할·전용도구 결박, 전사와 동의의 연결, 허용 번호 밖 발신 및 자기 발신 차단 검사. Node 198건·Python 23건 자동 검사 통과 기록. </w:t>
+        <w:t xml:space="preserve">음성 연결 검증: 설치 SDK의 세션 준비 이전 역할·전용도구 결박, 전사와 동의의 연결, 회신 수신자 확인 전 정보 공개 차단, 허용 번호 밖 발신 및 자기 발신 차단 검사. Node 198건·Python 32건 자동 검사 통과 기록. </w:t>
       </w:r>
       <w:hyperlink r:id="rId25">
         <w:r>
@@ -2887,7 +2887,7 @@
                 <w:color w:val="1E2124"/>
                 <w:sz w:val="17"/>
               </w:rPr>
-              <w:t>Python 23건 검사</w:t>
+              <w:t>Python 32건 검사</w:t>
             </w:r>
           </w:p>
         </w:tc>

</xml_diff>